<commit_message>
docs: update demo video link in concept note for accessibility
</commit_message>
<xml_diff>
--- a/CONCEPT NOTE.docx
+++ b/CONCEPT NOTE.docx
@@ -85,83 +85,127 @@
           <w:szCs w:val="40"/>
         </w:rPr>
       </w:pPr>
-      <w:r>
+      <w:hyperlink r:id="rId5" w:history="1">
+        <w:r>
+          <w:rPr>
+            <w:rStyle w:val="Hyperlink"/>
+            <w:b/>
+            <w:bCs/>
+            <w:sz w:val="40"/>
+            <w:szCs w:val="40"/>
+          </w:rPr>
+          <w:t>YouTube Demo Vid</w:t>
+        </w:r>
+        <w:r>
+          <w:rPr>
+            <w:rStyle w:val="Hyperlink"/>
+            <w:b/>
+            <w:bCs/>
+            <w:sz w:val="40"/>
+            <w:szCs w:val="40"/>
+          </w:rPr>
+          <w:t>e</w:t>
+        </w:r>
+        <w:r>
+          <w:rPr>
+            <w:rStyle w:val="Hyperlink"/>
+            <w:b/>
+            <w:bCs/>
+            <w:sz w:val="40"/>
+            <w:szCs w:val="40"/>
+          </w:rPr>
+          <w:t>o</w:t>
+        </w:r>
+      </w:hyperlink>
+    </w:p>
+    <w:p>
+      <w:pPr>
         <w:rPr>
           <w:b/>
           <w:bCs/>
           <w:sz w:val="36"/>
           <w:szCs w:val="36"/>
         </w:rPr>
-        <w:t>DEMO VIDEO-</w:t>
-      </w:r>
-      <w:r>
-        <w:rPr>
-          <w:b/>
-          <w:bCs/>
-          <w:sz w:val="40"/>
-          <w:szCs w:val="40"/>
-        </w:rPr>
-        <w:t xml:space="preserve"> </w:t>
-      </w:r>
-      <w:r>
-        <w:rPr>
-          <w:noProof/>
-          <w:sz w:val="40"/>
-          <w:szCs w:val="40"/>
-        </w:rPr>
-        <w:drawing>
-          <wp:inline distT="0" distB="0" distL="0" distR="0" wp14:anchorId="474B9CE3" wp14:editId="79C9C9C2">
-            <wp:extent cx="4968694" cy="2832100"/>
-            <wp:effectExtent l="0" t="0" r="3810" b="6350"/>
-            <wp:docPr id="829752566" name="Video 1" descr="processed demo input">
-              <a:hlinkClick xmlns:a="http://schemas.openxmlformats.org/drawingml/2006/main" r:id="rId5"/>
-            </wp:docPr>
-            <wp:cNvGraphicFramePr>
-              <a:graphicFrameLocks xmlns:a="http://schemas.openxmlformats.org/drawingml/2006/main" noChangeAspect="1"/>
-            </wp:cNvGraphicFramePr>
-            <a:graphic xmlns:a="http://schemas.openxmlformats.org/drawingml/2006/main">
-              <a:graphicData uri="http://schemas.openxmlformats.org/drawingml/2006/picture">
-                <pic:pic xmlns:pic="http://schemas.openxmlformats.org/drawingml/2006/picture">
-                  <pic:nvPicPr>
-                    <pic:cNvPr id="829752566" name="Video 1" descr="processed demo input">
-                      <a:hlinkClick r:id="rId5"/>
-                    </pic:cNvPr>
-                    <pic:cNvPicPr/>
-                  </pic:nvPicPr>
-                  <pic:blipFill>
-                    <a:blip r:embed="rId6">
-                      <a:extLst>
-                        <a:ext uri="{28A0092B-C50C-407E-A947-70E740481C1C}">
-                          <a14:useLocalDpi xmlns:a14="http://schemas.microsoft.com/office/drawing/2010/main" val="0"/>
-                        </a:ext>
-                        <a:ext uri="{C809E66F-F1BF-436E-b5F7-EEA9579F0CBA}">
-                          <wp15:webVideoPr xmlns:wp15="http://schemas.microsoft.com/office/word/2012/wordprocessingDrawing" embeddedHtml="&lt;iframe width=&quot;200&quot; height=&quot;113&quot; src=&quot;https://www.youtube.com/embed/WmNx7r8-I0U?feature=oembed&quot; frameborder=&quot;0&quot; allow=&quot;accelerometer; autoplay; clipboard-write; encrypted-media; gyroscope; picture-in-picture; web-share&quot; referrerpolicy=&quot;strict-origin-when-cross-origin&quot; allowfullscreen=&quot;&quot; title=&quot;processed demo input&quot; sandbox=&quot;allow-scripts allow-same-origin allow-popups&quot;&gt;&lt;/iframe&gt;" h="113" w="200"/>
-                        </a:ext>
-                      </a:extLst>
-                    </a:blip>
-                    <a:stretch>
-                      <a:fillRect/>
-                    </a:stretch>
-                  </pic:blipFill>
-                  <pic:spPr>
-                    <a:xfrm>
-                      <a:off x="0" y="0"/>
-                      <a:ext cx="4997423" cy="2848475"/>
-                    </a:xfrm>
-                    <a:prstGeom prst="rect">
-                      <a:avLst/>
-                    </a:prstGeom>
-                  </pic:spPr>
-                </pic:pic>
-              </a:graphicData>
-            </a:graphic>
-          </wp:inline>
-        </w:drawing>
+      </w:pPr>
+      <w:r>
+        <w:rPr>
+          <w:b/>
+          <w:bCs/>
+          <w:sz w:val="36"/>
+          <w:szCs w:val="36"/>
+        </w:rPr>
+        <w:t>1. Executive Summary</w:t>
       </w:r>
     </w:p>
     <w:p>
       <w:pPr>
         <w:rPr>
+          <w:sz w:val="28"/>
+          <w:szCs w:val="28"/>
+        </w:rPr>
+      </w:pPr>
+      <w:r>
+        <w:rPr>
+          <w:sz w:val="28"/>
+          <w:szCs w:val="28"/>
+        </w:rPr>
+        <w:t>Currently, the National Highways Authority of India (NHAI) relies on manual, hand-held devices to measure the retro-reflectivity of highway signs and pavement markings. This methodology is dangerously unsafe for personnel operating near high-speed traffic and fundamentally unscalable across India’s vast expressway network.</w:t>
+      </w:r>
+    </w:p>
+    <w:p>
+      <w:pPr>
+        <w:rPr>
+          <w:sz w:val="28"/>
+          <w:szCs w:val="28"/>
+        </w:rPr>
+      </w:pPr>
+      <w:proofErr w:type="spellStart"/>
+      <w:r>
+        <w:rPr>
+          <w:b/>
+          <w:bCs/>
+          <w:sz w:val="28"/>
+          <w:szCs w:val="28"/>
+        </w:rPr>
+        <w:t>RetroVision</w:t>
+      </w:r>
+      <w:proofErr w:type="spellEnd"/>
+      <w:r>
+        <w:rPr>
+          <w:b/>
+          <w:bCs/>
+          <w:sz w:val="28"/>
+          <w:szCs w:val="28"/>
+        </w:rPr>
+        <w:t xml:space="preserve"> AI</w:t>
+      </w:r>
+      <w:r>
+        <w:rPr>
+          <w:sz w:val="28"/>
+          <w:szCs w:val="28"/>
+        </w:rPr>
+        <w:t xml:space="preserve"> provides a completely automated, software-driven alternative. Utilizing advanced computer vision physics and machine learning, our pipeline extracts highly accurate luminance data from uncalibrated, standard vehicle dashcams at highway speeds. This solution </w:t>
+      </w:r>
+      <w:proofErr w:type="spellStart"/>
+      <w:r>
+        <w:rPr>
+          <w:sz w:val="28"/>
+          <w:szCs w:val="28"/>
+        </w:rPr>
+        <w:t>fulfills</w:t>
+      </w:r>
+      <w:proofErr w:type="spellEnd"/>
+      <w:r>
+        <w:rPr>
+          <w:sz w:val="28"/>
+          <w:szCs w:val="28"/>
+        </w:rPr>
+        <w:t xml:space="preserve"> NHAI’s objective to deploy AI/ML techniques for continuous O&amp;M inspection without requiring multi-million-rupee LIDAR hardware.</w:t>
+      </w:r>
+    </w:p>
+    <w:p>
+      <w:pPr>
+        <w:rPr>
           <w:b/>
           <w:bCs/>
           <w:sz w:val="36"/>
@@ -175,7 +219,7 @@
           <w:sz w:val="36"/>
           <w:szCs w:val="36"/>
         </w:rPr>
-        <w:t>1. Executive Summary</w:t>
+        <w:t xml:space="preserve">2. Innovation </w:t>
       </w:r>
     </w:p>
     <w:p>
@@ -190,35 +234,11 @@
           <w:sz w:val="28"/>
           <w:szCs w:val="28"/>
         </w:rPr>
-        <w:t>Currently, the National Highways Authority of India (NHAI) relies on manual, hand-held devices to measure the retro</w:t>
-      </w:r>
-      <w:r>
-        <w:rPr>
-          <w:sz w:val="28"/>
-          <w:szCs w:val="28"/>
-        </w:rPr>
-        <w:t>-</w:t>
-      </w:r>
-      <w:r>
-        <w:rPr>
-          <w:sz w:val="28"/>
-          <w:szCs w:val="28"/>
-        </w:rPr>
-        <w:t>reflectivity of highway signs and pavement markings. This methodology is dangerously unsafe for personnel operating near high-speed traffic and fundamentally unscalable across India’s vast expressway network.</w:t>
-      </w:r>
-    </w:p>
-    <w:p>
-      <w:pPr>
-        <w:rPr>
-          <w:sz w:val="28"/>
-          <w:szCs w:val="28"/>
-        </w:rPr>
-      </w:pPr>
+        <w:t xml:space="preserve">Standard computer vision algorithms fail on Indian highways due to dynamic real-world physics—headlight glare washes out paint, and diagonal concrete crash barriers mimic lane markings. </w:t>
+      </w:r>
       <w:proofErr w:type="spellStart"/>
       <w:r>
         <w:rPr>
-          <w:b/>
-          <w:bCs/>
           <w:sz w:val="28"/>
           <w:szCs w:val="28"/>
         </w:rPr>
@@ -227,114 +247,10 @@
       <w:proofErr w:type="spellEnd"/>
       <w:r>
         <w:rPr>
-          <w:b/>
-          <w:bCs/>
-          <w:sz w:val="28"/>
-          <w:szCs w:val="28"/>
-        </w:rPr>
-        <w:t xml:space="preserve"> AI</w:t>
-      </w:r>
-      <w:r>
-        <w:rPr>
-          <w:sz w:val="28"/>
-          <w:szCs w:val="28"/>
-        </w:rPr>
-        <w:t xml:space="preserve"> provides a completely automated, software-driven alternative. Utilizing advanced computer vision physics and machine learning, our pipeline extracts highly accurate luminance data from uncalibrated, standard vehicle dashcams at highway speeds. This solution </w:t>
-      </w:r>
-      <w:proofErr w:type="spellStart"/>
-      <w:r>
-        <w:rPr>
-          <w:sz w:val="28"/>
-          <w:szCs w:val="28"/>
-        </w:rPr>
-        <w:t>fulfills</w:t>
-      </w:r>
-      <w:proofErr w:type="spellEnd"/>
-      <w:r>
-        <w:rPr>
-          <w:sz w:val="28"/>
-          <w:szCs w:val="28"/>
-        </w:rPr>
-        <w:t xml:space="preserve"> NHAI’s objective to deploy AI/ML techniques for continuous O&amp;M inspection without requiring multi-million-rupee LIDAR hardware.</w:t>
-      </w:r>
-    </w:p>
-    <w:p>
-      <w:pPr>
-        <w:rPr>
-          <w:b/>
-          <w:bCs/>
-          <w:sz w:val="36"/>
-          <w:szCs w:val="36"/>
-        </w:rPr>
-      </w:pPr>
-      <w:r>
-        <w:rPr>
-          <w:b/>
-          <w:bCs/>
-          <w:sz w:val="36"/>
-          <w:szCs w:val="36"/>
-        </w:rPr>
-        <w:lastRenderedPageBreak/>
-        <w:t xml:space="preserve">2. Innovation </w:t>
-      </w:r>
-    </w:p>
-    <w:p>
-      <w:pPr>
-        <w:rPr>
-          <w:sz w:val="28"/>
-          <w:szCs w:val="28"/>
-        </w:rPr>
-      </w:pPr>
-      <w:r>
-        <w:rPr>
-          <w:sz w:val="28"/>
-          <w:szCs w:val="28"/>
-        </w:rPr>
-        <w:t xml:space="preserve">Standard computer vision algorithms fail on Indian highways due to dynamic real-world physics—headlight glare washes out paint, and diagonal concrete crash barriers mimic lane markings. </w:t>
-      </w:r>
-      <w:proofErr w:type="spellStart"/>
-      <w:r>
-        <w:rPr>
-          <w:sz w:val="28"/>
-          <w:szCs w:val="28"/>
-        </w:rPr>
-        <w:t>RetroVision</w:t>
-      </w:r>
-      <w:proofErr w:type="spellEnd"/>
-      <w:r>
-        <w:rPr>
-          <w:sz w:val="28"/>
-          <w:szCs w:val="28"/>
-        </w:rPr>
-        <w:t xml:space="preserve"> AI discards brittle colo</w:t>
-      </w:r>
-      <w:r>
-        <w:rPr>
-          <w:sz w:val="28"/>
-          <w:szCs w:val="28"/>
-        </w:rPr>
-        <w:t>u</w:t>
-      </w:r>
-      <w:r>
-        <w:rPr>
-          <w:sz w:val="28"/>
-          <w:szCs w:val="28"/>
-        </w:rPr>
-        <w:t>r-blob detection in favo</w:t>
-      </w:r>
-      <w:r>
-        <w:rPr>
-          <w:sz w:val="28"/>
-          <w:szCs w:val="28"/>
-        </w:rPr>
-        <w:t>u</w:t>
-      </w:r>
-      <w:r>
-        <w:rPr>
-          <w:sz w:val="28"/>
-          <w:szCs w:val="28"/>
-        </w:rPr>
-        <w:t>r of structural mathematics:</w:t>
+          <w:sz w:val="28"/>
+          <w:szCs w:val="28"/>
+        </w:rPr>
+        <w:t xml:space="preserve"> AI discards brittle colour-blob detection in favour of structural mathematics:</w:t>
       </w:r>
     </w:p>
     <w:p>
@@ -390,6 +306,7 @@
           <w:sz w:val="32"/>
           <w:szCs w:val="32"/>
         </w:rPr>
+        <w:lastRenderedPageBreak/>
         <w:t>Sobel-X Gradient Physics</w:t>
       </w:r>
       <w:r>
@@ -572,7 +489,6 @@
           <w:sz w:val="32"/>
           <w:szCs w:val="32"/>
         </w:rPr>
-        <w:lastRenderedPageBreak/>
         <w:t>Dynamic Auto-Calibration:</w:t>
       </w:r>
       <w:r>
@@ -583,21 +499,7 @@
           <w:sz w:val="28"/>
           <w:szCs w:val="28"/>
         </w:rPr>
-        <w:t>The system continuously calculates the ambient v</w:t>
-      </w:r>
-      <w:r>
-        <w:rPr>
-          <w:sz w:val="28"/>
-          <w:szCs w:val="28"/>
-        </w:rPr>
-        <w:t>-</w:t>
-      </w:r>
-      <w:r>
-        <w:rPr>
-          <w:sz w:val="28"/>
-          <w:szCs w:val="28"/>
-        </w:rPr>
-        <w:t>channel frame mean, dynamically adjusting its own detection thresholds to maintain accuracy during the transition from day to night.</w:t>
+        <w:t>The system continuously calculates the ambient v-channel frame mean, dynamically adjusting its own detection thresholds to maintain accuracy during the transition from day to night.</w:t>
       </w:r>
     </w:p>
     <w:p>
@@ -715,6 +617,7 @@
           <w:sz w:val="32"/>
           <w:szCs w:val="32"/>
         </w:rPr>
+        <w:lastRenderedPageBreak/>
         <w:t>Automated Maintenance Dashboard:</w:t>
       </w:r>
       <w:r>
@@ -1859,6 +1762,7 @@
   <w:style w:type="character" w:default="1" w:styleId="DefaultParagraphFont">
     <w:name w:val="Default Paragraph Font"/>
     <w:uiPriority w:val="1"/>
+    <w:semiHidden/>
     <w:unhideWhenUsed/>
   </w:style>
   <w:style w:type="table" w:default="1" w:styleId="TableNormal">
@@ -2170,6 +2074,41 @@
       <w:smallCaps/>
       <w:color w:val="0F4761" w:themeColor="accent1" w:themeShade="BF"/>
       <w:spacing w:val="5"/>
+    </w:rPr>
+  </w:style>
+  <w:style w:type="character" w:styleId="Hyperlink">
+    <w:name w:val="Hyperlink"/>
+    <w:basedOn w:val="DefaultParagraphFont"/>
+    <w:uiPriority w:val="99"/>
+    <w:unhideWhenUsed/>
+    <w:rsid w:val="005C7F3D"/>
+    <w:rPr>
+      <w:color w:val="467886" w:themeColor="hyperlink"/>
+      <w:u w:val="single"/>
+    </w:rPr>
+  </w:style>
+  <w:style w:type="character" w:styleId="UnresolvedMention">
+    <w:name w:val="Unresolved Mention"/>
+    <w:basedOn w:val="DefaultParagraphFont"/>
+    <w:uiPriority w:val="99"/>
+    <w:semiHidden/>
+    <w:unhideWhenUsed/>
+    <w:rsid w:val="005C7F3D"/>
+    <w:rPr>
+      <w:color w:val="605E5C"/>
+      <w:shd w:val="clear" w:color="auto" w:fill="E1DFDD"/>
+    </w:rPr>
+  </w:style>
+  <w:style w:type="character" w:styleId="FollowedHyperlink">
+    <w:name w:val="FollowedHyperlink"/>
+    <w:basedOn w:val="DefaultParagraphFont"/>
+    <w:uiPriority w:val="99"/>
+    <w:semiHidden/>
+    <w:unhideWhenUsed/>
+    <w:rsid w:val="005C7F3D"/>
+    <w:rPr>
+      <w:color w:val="96607D" w:themeColor="followedHyperlink"/>
+      <w:u w:val="single"/>
     </w:rPr>
   </w:style>
 </w:styles>

</xml_diff>